<commit_message>
docs: nombre del estudiante (Yuri Rojas) en informe y documentacion
</commit_message>
<xml_diff>
--- a/docs/casos_caja_negra_plantilla_llena.docx
+++ b/docs/casos_caja_negra_plantilla_llena.docx
@@ -2052,7 +2052,7 @@
               <w:jc w:val="left"/>
             </w:pPr>
             <w:r>
-              <w:t>Yuri Jesús (GitHub: mew145)</w:t>
+              <w:t>Yuri Rojas (GitHub: mew145)</w:t>
             </w:r>
             <w:r>
               <w:rPr>
@@ -5482,7 +5482,7 @@
               <w:jc w:val="left"/>
             </w:pPr>
             <w:r>
-              <w:t>Yuri Jesús (GitHub: mew145)</w:t>
+              <w:t>Yuri Rojas (GitHub: mew145)</w:t>
             </w:r>
             <w:r>
               <w:rPr>
@@ -8777,7 +8777,7 @@
               <w:jc w:val="left"/>
             </w:pPr>
             <w:r>
-              <w:t>Yuri Jesús (GitHub: mew145)</w:t>
+              <w:t>Yuri Rojas (GitHub: mew145)</w:t>
             </w:r>
             <w:r>
               <w:rPr>
@@ -12072,7 +12072,7 @@
               <w:jc w:val="left"/>
             </w:pPr>
             <w:r>
-              <w:t>Yuri Jesús (GitHub: mew145)</w:t>
+              <w:t>Yuri Rojas (GitHub: mew145)</w:t>
             </w:r>
             <w:r>
               <w:rPr>
@@ -15373,7 +15373,7 @@
               <w:jc w:val="left"/>
             </w:pPr>
             <w:r>
-              <w:t>Yuri Jesús (GitHub: mew145)</w:t>
+              <w:t>Yuri Rojas (GitHub: mew145)</w:t>
             </w:r>
             <w:r>
               <w:rPr>

</xml_diff>